<commit_message>
feat: actualizar documentos de investigación y añadir nuevas fuentes al vault
</commit_message>
<xml_diff>
--- a/investigación/DOC-02_Catalogo_Fuentes.docx
+++ b/investigación/DOC-02_Catalogo_Fuentes.docx
@@ -12564,6 +12564,392 @@
         <w:t xml:space="preserve"/>
       </w:r>
     </w:p>
+    <w:p>
+      <w:pPr>
+        <w:pStyle w:val="Heading2"/>
+        <w:spacing w:after="120" w:before="240"/>
+      </w:pPr>
+      <w:r>
+        <w:rPr>
+          <w:rFonts w:ascii="Arial" w:cs="Arial" w:eastAsia="Arial" w:hAnsi="Arial"/>
+          <w:b/>
+          <w:bCs/>
+          <w:color w:val="2E75B6"/>
+          <w:sz w:val="24"/>
+          <w:szCs w:val="24"/>
+        </w:rPr>
+        <w:t>Categoría H: Marcos Teóricos Unificadores</w:t>
+      </w:r>
+    </w:p>
+    <w:tbl>
+      <w:tblPr>
+        <w:tblW w:type="dxa" w:w="13360"/>
+        <w:tblBorders>
+          <w:top w:val="single" w:color="auto" w:sz="4"/>
+          <w:left w:val="single" w:color="auto" w:sz="4"/>
+          <w:bottom w:val="single" w:color="auto" w:sz="4"/>
+          <w:right w:val="single" w:color="auto" w:sz="4"/>
+          <w:insideH w:val="single" w:color="auto" w:sz="4"/>
+          <w:insideV w:val="single" w:color="auto" w:sz="4"/>
+        </w:tblBorders>
+      </w:tblPr>
+      <w:tblGrid>
+        <w:gridCol w:w="1000"/>
+        <w:gridCol w:w="3000"/>
+        <w:gridCol w:w="2280"/>
+        <w:gridCol w:w="3680"/>
+        <w:gridCol w:w="3400"/>
+      </w:tblGrid>
+      <w:tr>
+        <w:tc>
+          <w:tcPr>
+            <w:tcW w:type="dxa" w:w="1000"/>
+          </w:tcPr>
+          <w:p>
+            <w:r>
+              <w:rPr>
+                <w:rFonts w:ascii="Arial" w:cs="Arial" w:hAnsi="Arial"/>
+                <w:b/>
+                <w:color w:val="2E75B6"/>
+                <w:sz w:val="18"/>
+              </w:rPr>
+              <w:t>ID</w:t>
+            </w:r>
+          </w:p>
+        </w:tc>
+        <w:tc>
+          <w:tcPr>
+            <w:tcW w:type="dxa" w:w="3000"/>
+          </w:tcPr>
+          <w:p>
+            <w:r>
+              <w:rPr>
+                <w:rFonts w:ascii="Arial" w:cs="Arial" w:hAnsi="Arial"/>
+                <w:b/>
+                <w:color w:val="2E75B6"/>
+                <w:sz w:val="18"/>
+              </w:rPr>
+              <w:t>Fuente</w:t>
+            </w:r>
+          </w:p>
+        </w:tc>
+        <w:tc>
+          <w:tcPr>
+            <w:tcW w:type="dxa" w:w="2280"/>
+          </w:tcPr>
+          <w:p>
+            <w:r>
+              <w:rPr>
+                <w:rFonts w:ascii="Arial" w:cs="Arial" w:hAnsi="Arial"/>
+                <w:b/>
+                <w:color w:val="2E75B6"/>
+                <w:sz w:val="18"/>
+              </w:rPr>
+              <w:t>Tipo</w:t>
+            </w:r>
+          </w:p>
+        </w:tc>
+        <w:tc>
+          <w:tcPr>
+            <w:tcW w:type="dxa" w:w="3680"/>
+          </w:tcPr>
+          <w:p>
+            <w:r>
+              <w:rPr>
+                <w:rFonts w:ascii="Arial" w:cs="Arial" w:hAnsi="Arial"/>
+                <w:b/>
+                <w:color w:val="2E75B6"/>
+                <w:sz w:val="18"/>
+              </w:rPr>
+              <w:t>Hallazgo clave</w:t>
+            </w:r>
+          </w:p>
+        </w:tc>
+        <w:tc>
+          <w:tcPr>
+            <w:tcW w:type="dxa" w:w="3400"/>
+          </w:tcPr>
+          <w:p>
+            <w:r>
+              <w:rPr>
+                <w:rFonts w:ascii="Arial" w:cs="Arial" w:hAnsi="Arial"/>
+                <w:b/>
+                <w:color w:val="2E75B6"/>
+                <w:sz w:val="18"/>
+              </w:rPr>
+              <w:t>Relevancia para la tesis</w:t>
+            </w:r>
+          </w:p>
+        </w:tc>
+      </w:tr>
+      <w:tr>
+        <w:tc>
+          <w:tcPr>
+            <w:tcW w:type="dxa" w:w="1000"/>
+          </w:tcPr>
+          <w:p>
+            <w:r>
+              <w:rPr>
+                <w:rFonts w:ascii="Arial" w:cs="Arial" w:hAnsi="Arial"/>
+                <w:sz w:val="18"/>
+              </w:rPr>
+              <w:t>H-01</w:t>
+            </w:r>
+          </w:p>
+        </w:tc>
+        <w:tc>
+          <w:tcPr>
+            <w:tcW w:type="dxa" w:w="3000"/>
+          </w:tcPr>
+          <w:p>
+            <w:r>
+              <w:rPr>
+                <w:rFonts w:ascii="Arial" w:cs="Arial" w:hAnsi="Arial"/>
+                <w:sz w:val="18"/>
+              </w:rPr>
+              <w:t xml:space="preserve">Zhou, C., et al. (2026). Externalization in LLM-Based Agents: A Survey. arXiv:2604.08224. https://arxiv.org/abs/2604.08224</w:t>
+            </w:r>
+          </w:p>
+        </w:tc>
+        <w:tc>
+          <w:tcPr>
+            <w:tcW w:type="dxa" w:w="2280"/>
+          </w:tcPr>
+          <w:p>
+            <w:r>
+              <w:rPr>
+                <w:rFonts w:ascii="Arial" w:cs="Arial" w:hAnsi="Arial"/>
+                <w:sz w:val="18"/>
+              </w:rPr>
+              <w:t>Survey académico (preprint)</w:t>
+            </w:r>
+          </w:p>
+        </w:tc>
+        <w:tc>
+          <w:tcPr>
+            <w:tcW w:type="dxa" w:w="3680"/>
+          </w:tcPr>
+          <w:p>
+            <w:r>
+              <w:rPr>
+                <w:rFonts w:ascii="Arial" w:cs="Arial" w:hAnsi="Arial"/>
+                <w:sz w:val="18"/>
+              </w:rPr>
+              <w:t xml:space="preserve">Paradigma de externalización: memoria externaliza estado, skills externalizan conocimiento procedural, protocolos externalizan estructura de interacción, harness coordina todo. Progresión histórica: pesos → contexto → harness.</w:t>
+            </w:r>
+          </w:p>
+        </w:tc>
+        <w:tc>
+          <w:tcPr>
+            <w:tcW w:type="dxa" w:w="3400"/>
+          </w:tcPr>
+          <w:p>
+            <w:r>
+              <w:rPr>
+                <w:rFonts w:ascii="Arial" w:cs="Arial" w:hAnsi="Arial"/>
+                <w:i/>
+                <w:color w:val="006666"/>
+                <w:sz w:val="18"/>
+              </w:rPr>
+              <w:t xml:space="preserve">Marco unificador que posiciona la tesis en la era del harness engineering. Cita directamente MemGPT, MemoryBank y Mem0. Fundamenta el Bloque 8 de Bases Teóricas.</w:t>
+            </w:r>
+          </w:p>
+        </w:tc>
+      </w:tr>
+    </w:tbl>
+    <w:p>
+      <w:pPr>
+        <w:pStyle w:val="Heading2"/>
+        <w:spacing w:after="120" w:before="240"/>
+      </w:pPr>
+      <w:r>
+        <w:rPr>
+          <w:rFonts w:ascii="Arial" w:cs="Arial" w:eastAsia="Arial" w:hAnsi="Arial"/>
+          <w:b/>
+          <w:bCs/>
+          <w:color w:val="2E75B6"/>
+          <w:sz w:val="24"/>
+          <w:szCs w:val="24"/>
+        </w:rPr>
+        <w:t>Categoría I: Fuentes Institucionales</w:t>
+      </w:r>
+    </w:p>
+    <w:tbl>
+      <w:tblPr>
+        <w:tblW w:type="dxa" w:w="13360"/>
+        <w:tblBorders>
+          <w:top w:val="single" w:color="auto" w:sz="4"/>
+          <w:left w:val="single" w:color="auto" w:sz="4"/>
+          <w:bottom w:val="single" w:color="auto" w:sz="4"/>
+          <w:right w:val="single" w:color="auto" w:sz="4"/>
+          <w:insideH w:val="single" w:color="auto" w:sz="4"/>
+          <w:insideV w:val="single" w:color="auto" w:sz="4"/>
+        </w:tblBorders>
+      </w:tblPr>
+      <w:tblGrid>
+        <w:gridCol w:w="1000"/>
+        <w:gridCol w:w="3000"/>
+        <w:gridCol w:w="2280"/>
+        <w:gridCol w:w="3680"/>
+        <w:gridCol w:w="3400"/>
+      </w:tblGrid>
+      <w:tr>
+        <w:tc>
+          <w:tcPr>
+            <w:tcW w:type="dxa" w:w="1000"/>
+          </w:tcPr>
+          <w:p>
+            <w:r>
+              <w:rPr>
+                <w:rFonts w:ascii="Arial" w:cs="Arial" w:hAnsi="Arial"/>
+                <w:b/>
+                <w:color w:val="2E75B6"/>
+                <w:sz w:val="18"/>
+              </w:rPr>
+              <w:t>ID</w:t>
+            </w:r>
+          </w:p>
+        </w:tc>
+        <w:tc>
+          <w:tcPr>
+            <w:tcW w:type="dxa" w:w="3000"/>
+          </w:tcPr>
+          <w:p>
+            <w:r>
+              <w:rPr>
+                <w:rFonts w:ascii="Arial" w:cs="Arial" w:hAnsi="Arial"/>
+                <w:b/>
+                <w:color w:val="2E75B6"/>
+                <w:sz w:val="18"/>
+              </w:rPr>
+              <w:t>Fuente</w:t>
+            </w:r>
+          </w:p>
+        </w:tc>
+        <w:tc>
+          <w:tcPr>
+            <w:tcW w:type="dxa" w:w="2280"/>
+          </w:tcPr>
+          <w:p>
+            <w:r>
+              <w:rPr>
+                <w:rFonts w:ascii="Arial" w:cs="Arial" w:hAnsi="Arial"/>
+                <w:b/>
+                <w:color w:val="2E75B6"/>
+                <w:sz w:val="18"/>
+              </w:rPr>
+              <w:t>Tipo</w:t>
+            </w:r>
+          </w:p>
+        </w:tc>
+        <w:tc>
+          <w:tcPr>
+            <w:tcW w:type="dxa" w:w="3680"/>
+          </w:tcPr>
+          <w:p>
+            <w:r>
+              <w:rPr>
+                <w:rFonts w:ascii="Arial" w:cs="Arial" w:hAnsi="Arial"/>
+                <w:b/>
+                <w:color w:val="2E75B6"/>
+                <w:sz w:val="18"/>
+              </w:rPr>
+              <w:t>Hallazgo clave</w:t>
+            </w:r>
+          </w:p>
+        </w:tc>
+        <w:tc>
+          <w:tcPr>
+            <w:tcW w:type="dxa" w:w="3400"/>
+          </w:tcPr>
+          <w:p>
+            <w:r>
+              <w:rPr>
+                <w:rFonts w:ascii="Arial" w:cs="Arial" w:hAnsi="Arial"/>
+                <w:b/>
+                <w:color w:val="2E75B6"/>
+                <w:sz w:val="18"/>
+              </w:rPr>
+              <w:t>Relevancia para la tesis</w:t>
+            </w:r>
+          </w:p>
+        </w:tc>
+      </w:tr>
+      <w:tr>
+        <w:tc>
+          <w:tcPr>
+            <w:tcW w:type="dxa" w:w="1000"/>
+          </w:tcPr>
+          <w:p>
+            <w:r>
+              <w:rPr>
+                <w:rFonts w:ascii="Arial" w:cs="Arial" w:hAnsi="Arial"/>
+                <w:sz w:val="18"/>
+              </w:rPr>
+              <w:t>I-01</w:t>
+            </w:r>
+          </w:p>
+        </w:tc>
+        <w:tc>
+          <w:tcPr>
+            <w:tcW w:type="dxa" w:w="3000"/>
+          </w:tcPr>
+          <w:p>
+            <w:r>
+              <w:rPr>
+                <w:rFonts w:ascii="Arial" w:cs="Arial" w:hAnsi="Arial"/>
+                <w:sz w:val="18"/>
+              </w:rPr>
+              <w:t xml:space="preserve">Gartner. (2025, junio 25). Gartner predicts over 40 percent of agentic AI projects will be canceled by end of 2027 [Press release]. https://www.gartner.com/en/newsroom/press-releases/2025-06-25-gartner-predicts-over-40-percent-of-agentic-ai-projects-will-be-canceled-by-end-of-2027</w:t>
+            </w:r>
+          </w:p>
+        </w:tc>
+        <w:tc>
+          <w:tcPr>
+            <w:tcW w:type="dxa" w:w="2280"/>
+          </w:tcPr>
+          <w:p>
+            <w:r>
+              <w:rPr>
+                <w:rFonts w:ascii="Arial" w:cs="Arial" w:hAnsi="Arial"/>
+                <w:sz w:val="18"/>
+              </w:rPr>
+              <w:t>Press release institucional</w:t>
+            </w:r>
+          </w:p>
+        </w:tc>
+        <w:tc>
+          <w:tcPr>
+            <w:tcW w:type="dxa" w:w="3680"/>
+          </w:tcPr>
+          <w:p>
+            <w:r>
+              <w:rPr>
+                <w:rFonts w:ascii="Arial" w:cs="Arial" w:hAnsi="Arial"/>
+                <w:sz w:val="18"/>
+              </w:rPr>
+              <w:t xml:space="preserve">Más del 40% de proyectos de IA agéntica serán cancelados antes de 2027 por costos escalantes y complejidad técnica de despliegue. Solo ~130 de miles de vendors tienen capacidades agénticas genuinas.</w:t>
+            </w:r>
+          </w:p>
+        </w:tc>
+        <w:tc>
+          <w:tcPr>
+            <w:tcW w:type="dxa" w:w="3400"/>
+          </w:tcPr>
+          <w:p>
+            <w:r>
+              <w:rPr>
+                <w:rFonts w:ascii="Arial" w:cs="Arial" w:hAnsi="Arial"/>
+                <w:i/>
+                <w:color w:val="006666"/>
+                <w:sz w:val="18"/>
+              </w:rPr>
+              <w:t xml:space="preserve">Evidencia institucional de que los agentes en producción siguen siendo un problema no resuelto. Refuerza la justificación en Realidad Problemática. No citar como evidencia directa de context rot.</w:t>
+            </w:r>
+          </w:p>
+        </w:tc>
+      </w:tr>
+    </w:tbl>
     <w:p>
       <w:pPr>
         <w:pStyle w:val="Heading2"/>

</xml_diff>